<commit_message>
Docs: ask Lody whether the stand-in photos should show live
Co-Authored-By: Claude Opus 5.5 <noreply@anthropic.com>
</commit_message>
<xml_diff>
--- a/docs/questions-for-lody.docx
+++ b/docs/questions-for-lody.docx
@@ -4612,7 +4612,7 @@
                 <w:sz w:val="21"/>
                 <w:szCs w:val="21"/>
               </w:rPr>
-              <w:t xml:space="preserve">Which 8 to 12 products should appear in Shop Favorites on the home page?</w:t>
+              <w:t xml:space="preserve">You agreed to the AI-generated stand-in product photos. Should they also show on the live site until your own photos arrive, or only on the preview (staging) site, as now?</w:t>
             </w:r>
           </w:p>
         </w:tc>
@@ -4678,6 +4678,101 @@
                 <w:szCs w:val="21"/>
               </w:rPr>
               <w:t xml:space="preserve">40</w:t>
+            </w:r>
+          </w:p>
+        </w:tc>
+        <w:tc>
+          <w:tcPr>
+            <w:tcW w:type="dxa" w:w="5160"/>
+            <w:tcBorders>
+              <w:top w:val="single" w:color="BFBFBF" w:sz="4"/>
+              <w:left w:val="single" w:color="BFBFBF" w:sz="4"/>
+              <w:bottom w:val="single" w:color="BFBFBF" w:sz="4"/>
+              <w:right w:val="single" w:color="BFBFBF" w:sz="4"/>
+            </w:tcBorders>
+            <w:tcMar>
+              <w:top w:type="dxa" w:w="100"/>
+              <w:left w:type="dxa" w:w="120"/>
+              <w:bottom w:type="dxa" w:w="100"/>
+              <w:right w:type="dxa" w:w="120"/>
+            </w:tcMar>
+          </w:tcPr>
+          <w:p>
+            <w:pPr>
+              <w:spacing w:after="0"/>
+            </w:pPr>
+            <w:r>
+              <w:rPr>
+                <w:rFonts w:ascii="Calibri" w:cs="Calibri" w:eastAsia="Calibri" w:hAnsi="Calibri"/>
+                <w:sz w:val="21"/>
+                <w:szCs w:val="21"/>
+              </w:rPr>
+              <w:t xml:space="preserve">Which 8 to 12 products should appear in Shop Favorites on the home page?</w:t>
+            </w:r>
+          </w:p>
+        </w:tc>
+        <w:tc>
+          <w:tcPr>
+            <w:tcW w:type="dxa" w:w="3600"/>
+            <w:tcBorders>
+              <w:top w:val="single" w:color="BFBFBF" w:sz="4"/>
+              <w:left w:val="single" w:color="BFBFBF" w:sz="4"/>
+              <w:bottom w:val="single" w:color="BFBFBF" w:sz="4"/>
+              <w:right w:val="single" w:color="BFBFBF" w:sz="4"/>
+            </w:tcBorders>
+            <w:tcMar>
+              <w:top w:type="dxa" w:w="100"/>
+              <w:left w:type="dxa" w:w="120"/>
+              <w:bottom w:type="dxa" w:w="100"/>
+              <w:right w:type="dxa" w:w="120"/>
+            </w:tcMar>
+          </w:tcPr>
+          <w:p>
+            <w:pPr>
+              <w:spacing w:after="0"/>
+            </w:pPr>
+            <w:r>
+              <w:rPr>
+                <w:rFonts w:ascii="Calibri" w:cs="Calibri" w:eastAsia="Calibri" w:hAnsi="Calibri"/>
+                <w:sz w:val="21"/>
+                <w:szCs w:val="21"/>
+              </w:rPr>
+              <w:t xml:space="preserve"/>
+            </w:r>
+          </w:p>
+        </w:tc>
+      </w:tr>
+      <w:tr>
+        <w:trPr>
+          <w:cantSplit/>
+        </w:trPr>
+        <w:tc>
+          <w:tcPr>
+            <w:tcW w:type="dxa" w:w="600"/>
+            <w:tcBorders>
+              <w:top w:val="single" w:color="BFBFBF" w:sz="4"/>
+              <w:left w:val="single" w:color="BFBFBF" w:sz="4"/>
+              <w:bottom w:val="single" w:color="BFBFBF" w:sz="4"/>
+              <w:right w:val="single" w:color="BFBFBF" w:sz="4"/>
+            </w:tcBorders>
+            <w:tcMar>
+              <w:top w:type="dxa" w:w="100"/>
+              <w:left w:type="dxa" w:w="120"/>
+              <w:bottom w:type="dxa" w:w="100"/>
+              <w:right w:type="dxa" w:w="120"/>
+            </w:tcMar>
+          </w:tcPr>
+          <w:p>
+            <w:pPr>
+              <w:spacing w:after="0"/>
+            </w:pPr>
+            <w:r>
+              <w:rPr>
+                <w:rFonts w:ascii="Calibri" w:cs="Calibri" w:eastAsia="Calibri" w:hAnsi="Calibri"/>
+                <w:sz w:val="21"/>
+                <w:szCs w:val="21"/>
+              </w:rPr>
+              <w:t xml:space="preserve">41</w:t>
             </w:r>
           </w:p>
         </w:tc>

</xml_diff>